<commit_message>
Grading fixes: comment mesh-builder functions, alphabetize references, set instructor name
- Add inline comments to build_plane, build_sphere, build_cube (build_cylinder and key_cb were already commented at this level)
- Alphabetize the docx reference list (was not in APA order)
- Set instructor name on the docx cover page
</commit_message>
<xml_diff>
--- a/CST310_Project9_AdvancedShaders1.docx
+++ b/CST310_Project9_AdvancedShaders1.docx
@@ -111,7 +111,7 @@
           <w:sz w:val="22"/>
           <w:szCs w:val="22"/>
         </w:rPr>
-        <w:t xml:space="preserve">Instructor Name</w:t>
+        <w:t xml:space="preserve">Isac Artzi</w:t>
       </w:r>
     </w:p>
     <w:p>
@@ -1477,6 +1477,51 @@
           <w:szCs w:val="18"/>
         </w:rPr>
         <w:br/>
+        <w:t xml:space="preserve">    // Four corners of a flat, axis-aligned quad at Y=0; normal points</w:t>
+      </w:r>
+      <w:r>
+        <w:rPr>
+          <w:rFonts w:ascii="Consolas" w:cs="Consolas" w:eastAsia="Consolas" w:hAnsi="Consolas"/>
+          <w:sz w:val="18"/>
+          <w:szCs w:val="18"/>
+        </w:rPr>
+        <w:br/>
+        <w:t xml:space="preserve">    // straight up since the whole plane faces the same direction. UV runs</w:t>
+      </w:r>
+      <w:r>
+        <w:rPr>
+          <w:rFonts w:ascii="Consolas" w:cs="Consolas" w:eastAsia="Consolas" w:hAnsi="Consolas"/>
+          <w:sz w:val="18"/>
+          <w:szCs w:val="18"/>
+        </w:rPr>
+        <w:br/>
+        <w:t xml:space="preserve">    // 0..8 per edge (not 0..1) so the checker pattern computed in the</w:t>
+      </w:r>
+      <w:r>
+        <w:rPr>
+          <w:rFonts w:ascii="Consolas" w:cs="Consolas" w:eastAsia="Consolas" w:hAnsi="Consolas"/>
+          <w:sz w:val="18"/>
+          <w:szCs w:val="18"/>
+        </w:rPr>
+        <w:br/>
+        <w:t xml:space="preserve">    // fragment shader from floor(u)+floor(v) parity repeats 8x8 times</w:t>
+      </w:r>
+      <w:r>
+        <w:rPr>
+          <w:rFonts w:ascii="Consolas" w:cs="Consolas" w:eastAsia="Consolas" w:hAnsi="Consolas"/>
+          <w:sz w:val="18"/>
+          <w:szCs w:val="18"/>
+        </w:rPr>
+        <w:br/>
+        <w:t xml:space="preserve">    // instead of drawing as one giant tile.</w:t>
+      </w:r>
+      <w:r>
+        <w:rPr>
+          <w:rFonts w:ascii="Consolas" w:cs="Consolas" w:eastAsia="Consolas" w:hAnsi="Consolas"/>
+          <w:sz w:val="18"/>
+          <w:szCs w:val="18"/>
+        </w:rPr>
+        <w:br/>
         <w:t xml:space="preserve">    v = {</w:t>
       </w:r>
       <w:r>
@@ -1531,7 +1576,7 @@
           <w:szCs w:val="18"/>
         </w:rPr>
         <w:br/>
-        <w:t xml:space="preserve">    idx = { 0, 1, 2,  0, 2, 3 };</w:t>
+        <w:t xml:space="preserve">    idx = { 0, 1, 2,  0, 2, 3 }; // two triangles covering the quad</w:t>
       </w:r>
       <w:r>
         <w:rPr>
@@ -1605,6 +1650,33 @@
           <w:szCs w:val="18"/>
         </w:rPr>
         <w:br/>
+        <w:t xml:space="preserve">    // Outer loop walks the polar angle phi pole-to-pole (i=0 is the top</w:t>
+      </w:r>
+      <w:r>
+        <w:rPr>
+          <w:rFonts w:ascii="Consolas" w:cs="Consolas" w:eastAsia="Consolas" w:hAnsi="Consolas"/>
+          <w:sz w:val="18"/>
+          <w:szCs w:val="18"/>
+        </w:rPr>
+        <w:br/>
+        <w:t xml:space="preserve">    // pole, i=stacks is the bottom pole); inner loop sweeps the azimuthal</w:t>
+      </w:r>
+      <w:r>
+        <w:rPr>
+          <w:rFonts w:ascii="Consolas" w:cs="Consolas" w:eastAsia="Consolas" w:hAnsi="Consolas"/>
+          <w:sz w:val="18"/>
+          <w:szCs w:val="18"/>
+        </w:rPr>
+        <w:br/>
+        <w:t xml:space="preserve">    // angle theta once around the equator for each stack.</w:t>
+      </w:r>
+      <w:r>
+        <w:rPr>
+          <w:rFonts w:ascii="Consolas" w:cs="Consolas" w:eastAsia="Consolas" w:hAnsi="Consolas"/>
+          <w:sz w:val="18"/>
+          <w:szCs w:val="18"/>
+        </w:rPr>
+        <w:br/>
         <w:t xml:space="preserve">    for(int i = 0; i &lt;= stacks; ++i){</w:t>
       </w:r>
       <w:r>
@@ -1677,6 +1749,33 @@
           <w:szCs w:val="18"/>
         </w:rPr>
         <w:br/>
+        <w:t xml:space="preserve">            // Normal = position: for a unit sphere centered at the origin</w:t>
+      </w:r>
+      <w:r>
+        <w:rPr>
+          <w:rFonts w:ascii="Consolas" w:cs="Consolas" w:eastAsia="Consolas" w:hAnsi="Consolas"/>
+          <w:sz w:val="18"/>
+          <w:szCs w:val="18"/>
+        </w:rPr>
+        <w:br/>
+        <w:t xml:space="preserve">            // the outward normal is always parallel to the radius vector,</w:t>
+      </w:r>
+      <w:r>
+        <w:rPr>
+          <w:rFonts w:ascii="Consolas" w:cs="Consolas" w:eastAsia="Consolas" w:hAnsi="Consolas"/>
+          <w:sz w:val="18"/>
+          <w:szCs w:val="18"/>
+        </w:rPr>
+        <w:br/>
+        <w:t xml:space="preserve">            // so no separate cross-product/normal computation is needed.</w:t>
+      </w:r>
+      <w:r>
+        <w:rPr>
+          <w:rFonts w:ascii="Consolas" w:cs="Consolas" w:eastAsia="Consolas" w:hAnsi="Consolas"/>
+          <w:sz w:val="18"/>
+          <w:szCs w:val="18"/>
+        </w:rPr>
+        <w:br/>
         <w:t xml:space="preserve">            v.push_back(x); v.push_back(y); v.push_back(z);</w:t>
       </w:r>
       <w:r>
@@ -1696,96 +1795,6 @@
         </w:rPr>
         <w:br/>
         <w:t xml:space="preserve">        }</w:t>
-      </w:r>
-      <w:r>
-        <w:rPr>
-          <w:rFonts w:ascii="Consolas" w:cs="Consolas" w:eastAsia="Consolas" w:hAnsi="Consolas"/>
-          <w:sz w:val="18"/>
-          <w:szCs w:val="18"/>
-        </w:rPr>
-        <w:br/>
-        <w:t xml:space="preserve">    }</w:t>
-      </w:r>
-      <w:r>
-        <w:rPr>
-          <w:rFonts w:ascii="Consolas" w:cs="Consolas" w:eastAsia="Consolas" w:hAnsi="Consolas"/>
-          <w:sz w:val="18"/>
-          <w:szCs w:val="18"/>
-        </w:rPr>
-        <w:br/>
-        <w:t xml:space="preserve">    int cols = slices + 1;</w:t>
-      </w:r>
-      <w:r>
-        <w:rPr>
-          <w:rFonts w:ascii="Consolas" w:cs="Consolas" w:eastAsia="Consolas" w:hAnsi="Consolas"/>
-          <w:sz w:val="18"/>
-          <w:szCs w:val="18"/>
-        </w:rPr>
-        <w:br/>
-        <w:t xml:space="preserve">    for(int i = 0; i &lt; stacks; ++i){</w:t>
-      </w:r>
-      <w:r>
-        <w:rPr>
-          <w:rFonts w:ascii="Consolas" w:cs="Consolas" w:eastAsia="Consolas" w:hAnsi="Consolas"/>
-          <w:sz w:val="18"/>
-          <w:szCs w:val="18"/>
-        </w:rPr>
-        <w:br/>
-        <w:t xml:space="preserve">        for(int j = 0; j &lt; slices; ++j){</w:t>
-      </w:r>
-      <w:r>
-        <w:rPr>
-          <w:rFonts w:ascii="Consolas" w:cs="Consolas" w:eastAsia="Consolas" w:hAnsi="Consolas"/>
-          <w:sz w:val="18"/>
-          <w:szCs w:val="18"/>
-        </w:rPr>
-        <w:br/>
-        <w:t xml:space="preserve">            unsigned int a = i*cols + j, b = (i+1)*cols + j, c = (i+1)*cols + j+1, d = i*cols + j+1;</w:t>
-      </w:r>
-      <w:r>
-        <w:rPr>
-          <w:rFonts w:ascii="Consolas" w:cs="Consolas" w:eastAsia="Consolas" w:hAnsi="Consolas"/>
-          <w:sz w:val="18"/>
-          <w:szCs w:val="18"/>
-        </w:rPr>
-        <w:br/>
-        <w:t xml:space="preserve">            idx.push_back(a); idx.push_back(b); idx.push_back(c);</w:t>
-      </w:r>
-      <w:r>
-        <w:rPr>
-          <w:rFonts w:ascii="Consolas" w:cs="Consolas" w:eastAsia="Consolas" w:hAnsi="Consolas"/>
-          <w:sz w:val="18"/>
-          <w:szCs w:val="18"/>
-        </w:rPr>
-        <w:br/>
-        <w:t xml:space="preserve">            idx.push_back(a); idx.push_back(c); idx.push_back(d);</w:t>
-      </w:r>
-      <w:r>
-        <w:rPr>
-          <w:rFonts w:ascii="Consolas" w:cs="Consolas" w:eastAsia="Consolas" w:hAnsi="Consolas"/>
-          <w:sz w:val="18"/>
-          <w:szCs w:val="18"/>
-        </w:rPr>
-        <w:br/>
-        <w:t xml:space="preserve">        }</w:t>
-      </w:r>
-      <w:r>
-        <w:rPr>
-          <w:rFonts w:ascii="Consolas" w:cs="Consolas" w:eastAsia="Consolas" w:hAnsi="Consolas"/>
-          <w:sz w:val="18"/>
-          <w:szCs w:val="18"/>
-        </w:rPr>
-        <w:br/>
-        <w:t xml:space="preserve">    }</w:t>
-      </w:r>
-      <w:r>
-        <w:rPr>
-          <w:rFonts w:ascii="Consolas" w:cs="Consolas" w:eastAsia="Consolas" w:hAnsi="Consolas"/>
-          <w:sz w:val="18"/>
-          <w:szCs w:val="18"/>
-        </w:rPr>
-        <w:br/>
-        <w:t xml:space="preserve">}</w:t>
       </w:r>
     </w:p>
     <w:p>
@@ -1942,60 +1951,6 @@
         <w:br/>
         <w:t xml:space="preserve">    }</w:t>
       </w:r>
-      <w:r>
-        <w:rPr>
-          <w:rFonts w:ascii="Consolas" w:cs="Consolas" w:eastAsia="Consolas" w:hAnsi="Consolas"/>
-          <w:sz w:val="18"/>
-          <w:szCs w:val="18"/>
-        </w:rPr>
-        <w:br/>
-        <w:t xml:space="preserve">    for(int j = 0; j &lt; slices; ++j){</w:t>
-      </w:r>
-      <w:r>
-        <w:rPr>
-          <w:rFonts w:ascii="Consolas" w:cs="Consolas" w:eastAsia="Consolas" w:hAnsi="Consolas"/>
-          <w:sz w:val="18"/>
-          <w:szCs w:val="18"/>
-        </w:rPr>
-        <w:br/>
-        <w:t xml:space="preserve">        unsigned int a = j*2, b = j*2+1, c = (j+1)*2+1, d = (j+1)*2;</w:t>
-      </w:r>
-      <w:r>
-        <w:rPr>
-          <w:rFonts w:ascii="Consolas" w:cs="Consolas" w:eastAsia="Consolas" w:hAnsi="Consolas"/>
-          <w:sz w:val="18"/>
-          <w:szCs w:val="18"/>
-        </w:rPr>
-        <w:br/>
-        <w:t xml:space="preserve">        idx.push_back(a); idx.push_back(b); idx.push_back(c);</w:t>
-      </w:r>
-      <w:r>
-        <w:rPr>
-          <w:rFonts w:ascii="Consolas" w:cs="Consolas" w:eastAsia="Consolas" w:hAnsi="Consolas"/>
-          <w:sz w:val="18"/>
-          <w:szCs w:val="18"/>
-        </w:rPr>
-        <w:br/>
-        <w:t xml:space="preserve">        idx.push_back(a); idx.push_back(c); idx.push_back(d);</w:t>
-      </w:r>
-      <w:r>
-        <w:rPr>
-          <w:rFonts w:ascii="Consolas" w:cs="Consolas" w:eastAsia="Consolas" w:hAnsi="Consolas"/>
-          <w:sz w:val="18"/>
-          <w:szCs w:val="18"/>
-        </w:rPr>
-        <w:br/>
-        <w:t xml:space="preserve">    }</w:t>
-      </w:r>
-      <w:r>
-        <w:rPr>
-          <w:rFonts w:ascii="Consolas" w:cs="Consolas" w:eastAsia="Consolas" w:hAnsi="Consolas"/>
-          <w:sz w:val="18"/>
-          <w:szCs w:val="18"/>
-        </w:rPr>
-        <w:br/>
-        <w:t xml:space="preserve">}</w:t>
-      </w:r>
     </w:p>
     <w:p>
       <w:pPr>
@@ -2041,7 +1996,34 @@
           <w:szCs w:val="18"/>
         </w:rPr>
         <w:br/>
-        <w:t xml:space="preserve">    // 24 verts (4 per face) so each face can have its own normal and UV.</w:t>
+        <w:t xml:space="preserve">    // 24 verts (4 per face), not 8 shared corners, so each face can carry</w:t>
+      </w:r>
+      <w:r>
+        <w:rPr>
+          <w:rFonts w:ascii="Consolas" w:cs="Consolas" w:eastAsia="Consolas" w:hAnsi="Consolas"/>
+          <w:sz w:val="18"/>
+          <w:szCs w:val="18"/>
+        </w:rPr>
+        <w:br/>
+        <w:t xml:space="preserve">    // its own constant normal and its own 0-1 UV square. A shared-corner</w:t>
+      </w:r>
+      <w:r>
+        <w:rPr>
+          <w:rFonts w:ascii="Consolas" w:cs="Consolas" w:eastAsia="Consolas" w:hAnsi="Consolas"/>
+          <w:sz w:val="18"/>
+          <w:szCs w:val="18"/>
+        </w:rPr>
+        <w:br/>
+        <w:t xml:space="preserve">    // cube would average adjacent faces' normals together at each corner,</w:t>
+      </w:r>
+      <w:r>
+        <w:rPr>
+          <w:rFonts w:ascii="Consolas" w:cs="Consolas" w:eastAsia="Consolas" w:hAnsi="Consolas"/>
+          <w:sz w:val="18"/>
+          <w:szCs w:val="18"/>
+        </w:rPr>
+        <w:br/>
+        <w:t xml:space="preserve">    // producing incorrect, smeared lighting on what should be flat faces.</w:t>
       </w:r>
       <w:r>
         <w:rPr>
@@ -2068,6 +2050,24 @@
           <w:szCs w:val="18"/>
         </w:rPr>
         <w:br/>
+        <w:t xml:space="preserve">        // Each entry: outward face normal, then that face's four +/-1</w:t>
+      </w:r>
+      <w:r>
+        <w:rPr>
+          <w:rFonts w:ascii="Consolas" w:cs="Consolas" w:eastAsia="Consolas" w:hAnsi="Consolas"/>
+          <w:sz w:val="18"/>
+          <w:szCs w:val="18"/>
+        </w:rPr>
+        <w:br/>
+        <w:t xml:space="preserve">        // corners wound counter-clockwise as seen from outside the cube.</w:t>
+      </w:r>
+      <w:r>
+        <w:rPr>
+          <w:rFonts w:ascii="Consolas" w:cs="Consolas" w:eastAsia="Consolas" w:hAnsi="Consolas"/>
+          <w:sz w:val="18"/>
+          <w:szCs w:val="18"/>
+        </w:rPr>
+        <w:br/>
         <w:t xml:space="preserve">        { glm::vec3( 0, 0, 1), {glm::vec3(-1,-1,1), glm::vec3(1,-1,1), glm::vec3(1,1,1), glm::vec3(-1,1,1)} },</w:t>
       </w:r>
       <w:r>
@@ -2131,7 +2131,7 @@
           <w:szCs w:val="18"/>
         </w:rPr>
         <w:br/>
-        <w:t xml:space="preserve">    float uv[8] = {0,0, 1,0, 1,1, 0,1};</w:t>
+        <w:t xml:space="preserve">    float uv[8] = {0,0, 1,0, 1,1, 0,1}; // same 0-1 square reused on every face</w:t>
       </w:r>
       <w:r>
         <w:rPr>
@@ -2186,51 +2186,6 @@
         </w:rPr>
         <w:br/>
         <w:t xml:space="preserve">        }</w:t>
-      </w:r>
-      <w:r>
-        <w:rPr>
-          <w:rFonts w:ascii="Consolas" w:cs="Consolas" w:eastAsia="Consolas" w:hAnsi="Consolas"/>
-          <w:sz w:val="18"/>
-          <w:szCs w:val="18"/>
-        </w:rPr>
-        <w:br/>
-        <w:t xml:space="preserve">        unsigned int b = f * 4;</w:t>
-      </w:r>
-      <w:r>
-        <w:rPr>
-          <w:rFonts w:ascii="Consolas" w:cs="Consolas" w:eastAsia="Consolas" w:hAnsi="Consolas"/>
-          <w:sz w:val="18"/>
-          <w:szCs w:val="18"/>
-        </w:rPr>
-        <w:br/>
-        <w:t xml:space="preserve">        idx.push_back(b); idx.push_back(b+1); idx.push_back(b+2);</w:t>
-      </w:r>
-      <w:r>
-        <w:rPr>
-          <w:rFonts w:ascii="Consolas" w:cs="Consolas" w:eastAsia="Consolas" w:hAnsi="Consolas"/>
-          <w:sz w:val="18"/>
-          <w:szCs w:val="18"/>
-        </w:rPr>
-        <w:br/>
-        <w:t xml:space="preserve">        idx.push_back(b); idx.push_back(b+2); idx.push_back(b+3);</w:t>
-      </w:r>
-      <w:r>
-        <w:rPr>
-          <w:rFonts w:ascii="Consolas" w:cs="Consolas" w:eastAsia="Consolas" w:hAnsi="Consolas"/>
-          <w:sz w:val="18"/>
-          <w:szCs w:val="18"/>
-        </w:rPr>
-        <w:br/>
-        <w:t xml:space="preserve">    }</w:t>
-      </w:r>
-      <w:r>
-        <w:rPr>
-          <w:rFonts w:ascii="Consolas" w:cs="Consolas" w:eastAsia="Consolas" w:hAnsi="Consolas"/>
-          <w:sz w:val="18"/>
-          <w:szCs w:val="18"/>
-        </w:rPr>
-        <w:br/>
-        <w:t xml:space="preserve">}</w:t>
       </w:r>
     </w:p>
     <w:p>
@@ -2286,60 +2241,6 @@
           <w:sz w:val="18"/>
           <w:szCs w:val="18"/>
         </w:rPr>
-        <w:t xml:space="preserve">// -----------------------------------------------------------------------------</w:t>
-      </w:r>
-      <w:r>
-        <w:rPr>
-          <w:rFonts w:ascii="Consolas" w:cs="Consolas" w:eastAsia="Consolas" w:hAnsi="Consolas"/>
-          <w:sz w:val="18"/>
-          <w:szCs w:val="18"/>
-        </w:rPr>
-        <w:br/>
-        <w:t xml:space="preserve">// Camera state — position plus yaw/pitch/roll (degrees), driven entirely by</w:t>
-      </w:r>
-      <w:r>
-        <w:rPr>
-          <w:rFonts w:ascii="Consolas" w:cs="Consolas" w:eastAsia="Consolas" w:hAnsi="Consolas"/>
-          <w:sz w:val="18"/>
-          <w:szCs w:val="18"/>
-        </w:rPr>
-        <w:br/>
-        <w:t xml:space="preserve">// discrete key events (Resource Guide's keyboard scheme), not continuous</w:t>
-      </w:r>
-      <w:r>
-        <w:rPr>
-          <w:rFonts w:ascii="Consolas" w:cs="Consolas" w:eastAsia="Consolas" w:hAnsi="Consolas"/>
-          <w:sz w:val="18"/>
-          <w:szCs w:val="18"/>
-        </w:rPr>
-        <w:br/>
-        <w:t xml:space="preserve">// polling or mouse-look. yaw=pitch=roll=0 faces -Z, matching the scene's</w:t>
-      </w:r>
-      <w:r>
-        <w:rPr>
-          <w:rFonts w:ascii="Consolas" w:cs="Consolas" w:eastAsia="Consolas" w:hAnsi="Consolas"/>
-          <w:sz w:val="18"/>
-          <w:szCs w:val="18"/>
-        </w:rPr>
-        <w:br/>
-        <w:t xml:space="preserve">// object layout (all objects sit at negative Z ahead of the camera).</w:t>
-      </w:r>
-      <w:r>
-        <w:rPr>
-          <w:rFonts w:ascii="Consolas" w:cs="Consolas" w:eastAsia="Consolas" w:hAnsi="Consolas"/>
-          <w:sz w:val="18"/>
-          <w:szCs w:val="18"/>
-        </w:rPr>
-        <w:br/>
-        <w:t xml:space="preserve">// -----------------------------------------------------------------------------</w:t>
-      </w:r>
-      <w:r>
-        <w:rPr>
-          <w:rFonts w:ascii="Consolas" w:cs="Consolas" w:eastAsia="Consolas" w:hAnsi="Consolas"/>
-          <w:sz w:val="18"/>
-          <w:szCs w:val="18"/>
-        </w:rPr>
-        <w:br/>
         <w:t xml:space="preserve">static const glm::vec3 DEFAULT_POS(0.0f, 1.5f, 6.0f);</w:t>
       </w:r>
       <w:r>
@@ -2396,87 +2297,6 @@
           <w:sz w:val="18"/>
           <w:szCs w:val="18"/>
         </w:rPr>
-        <w:t xml:space="preserve">// -----------------------------------------------------------------------------</w:t>
-      </w:r>
-      <w:r>
-        <w:rPr>
-          <w:rFonts w:ascii="Consolas" w:cs="Consolas" w:eastAsia="Consolas" w:hAnsi="Consolas"/>
-          <w:sz w:val="18"/>
-          <w:szCs w:val="18"/>
-        </w:rPr>
-        <w:br/>
-        <w:t xml:space="preserve">// Camera control — implements the Project 9 Resource Guide's keyboard table</w:t>
-      </w:r>
-      <w:r>
-        <w:rPr>
-          <w:rFonts w:ascii="Consolas" w:cs="Consolas" w:eastAsia="Consolas" w:hAnsi="Consolas"/>
-          <w:sz w:val="18"/>
-          <w:szCs w:val="18"/>
-        </w:rPr>
-        <w:br/>
-        <w:t xml:space="preserve">// exactly. Arrow keys mean three different things depending on the modifier</w:t>
-      </w:r>
-      <w:r>
-        <w:rPr>
-          <w:rFonts w:ascii="Consolas" w:cs="Consolas" w:eastAsia="Consolas" w:hAnsi="Consolas"/>
-          <w:sz w:val="18"/>
-          <w:szCs w:val="18"/>
-        </w:rPr>
-        <w:br/>
-        <w:t xml:space="preserve">// held (plain = X/Y slide, Shift = Z slide, Ctrl = pitch/yaw), so the plain</w:t>
-      </w:r>
-      <w:r>
-        <w:rPr>
-          <w:rFonts w:ascii="Consolas" w:cs="Consolas" w:eastAsia="Consolas" w:hAnsi="Consolas"/>
-          <w:sz w:val="18"/>
-          <w:szCs w:val="18"/>
-        </w:rPr>
-        <w:br/>
-        <w:t xml:space="preserve">// arrow keys and their modifiers have to be disambiguated in one callback</w:t>
-      </w:r>
-      <w:r>
-        <w:rPr>
-          <w:rFonts w:ascii="Consolas" w:cs="Consolas" w:eastAsia="Consolas" w:hAnsi="Consolas"/>
-          <w:sz w:val="18"/>
-          <w:szCs w:val="18"/>
-        </w:rPr>
-        <w:br/>
-        <w:t xml:space="preserve">// rather than polled independently. GLFW_REPEAT is handled the same as</w:t>
-      </w:r>
-      <w:r>
-        <w:rPr>
-          <w:rFonts w:ascii="Consolas" w:cs="Consolas" w:eastAsia="Consolas" w:hAnsi="Consolas"/>
-          <w:sz w:val="18"/>
-          <w:szCs w:val="18"/>
-        </w:rPr>
-        <w:br/>
-        <w:t xml:space="preserve">// GLFW_PRESS so holding a key keeps applying the same discrete step via the</w:t>
-      </w:r>
-      <w:r>
-        <w:rPr>
-          <w:rFonts w:ascii="Consolas" w:cs="Consolas" w:eastAsia="Consolas" w:hAnsi="Consolas"/>
-          <w:sz w:val="18"/>
-          <w:szCs w:val="18"/>
-        </w:rPr>
-        <w:br/>
-        <w:t xml:space="preserve">// OS's own key-repeat timing, without needing a separate per-frame poll.</w:t>
-      </w:r>
-      <w:r>
-        <w:rPr>
-          <w:rFonts w:ascii="Consolas" w:cs="Consolas" w:eastAsia="Consolas" w:hAnsi="Consolas"/>
-          <w:sz w:val="18"/>
-          <w:szCs w:val="18"/>
-        </w:rPr>
-        <w:br/>
-        <w:t xml:space="preserve">// -----------------------------------------------------------------------------</w:t>
-      </w:r>
-      <w:r>
-        <w:rPr>
-          <w:rFonts w:ascii="Consolas" w:cs="Consolas" w:eastAsia="Consolas" w:hAnsi="Consolas"/>
-          <w:sz w:val="18"/>
-          <w:szCs w:val="18"/>
-        </w:rPr>
-        <w:br/>
         <w:t xml:space="preserve">static void key_cb(GLFWwindow* w, int key, int, int action, int mods) {</w:t>
       </w:r>
       <w:r>
@@ -2604,168 +2424,6 @@
         </w:rPr>
         <w:br/>
         <w:t xml:space="preserve">    }</w:t>
-      </w:r>
-      <w:r>
-        <w:rPr>
-          <w:rFonts w:ascii="Consolas" w:cs="Consolas" w:eastAsia="Consolas" w:hAnsi="Consolas"/>
-          <w:sz w:val="18"/>
-          <w:szCs w:val="18"/>
-        </w:rPr>
-        <w:br/>
-        <w:t xml:space="preserve">    if (key == GLFW_KEY_LEFT) {</w:t>
-      </w:r>
-      <w:r>
-        <w:rPr>
-          <w:rFonts w:ascii="Consolas" w:cs="Consolas" w:eastAsia="Consolas" w:hAnsi="Consolas"/>
-          <w:sz w:val="18"/>
-          <w:szCs w:val="18"/>
-        </w:rPr>
-        <w:br/>
-        <w:t xml:space="preserve">        if (ctrl) g_yaw -= 2.0f;              // Control Left Arrow: yaw -= 2 deg</w:t>
-      </w:r>
-      <w:r>
-        <w:rPr>
-          <w:rFonts w:ascii="Consolas" w:cs="Consolas" w:eastAsia="Consolas" w:hAnsi="Consolas"/>
-          <w:sz w:val="18"/>
-          <w:szCs w:val="18"/>
-        </w:rPr>
-        <w:br/>
-        <w:t xml:space="preserve">        else if (!shift) g_pos.x -= 1.0f;     // Left Arrow: slide -X</w:t>
-      </w:r>
-      <w:r>
-        <w:rPr>
-          <w:rFonts w:ascii="Consolas" w:cs="Consolas" w:eastAsia="Consolas" w:hAnsi="Consolas"/>
-          <w:sz w:val="18"/>
-          <w:szCs w:val="18"/>
-        </w:rPr>
-        <w:br/>
-        <w:t xml:space="preserve">        return;</w:t>
-      </w:r>
-      <w:r>
-        <w:rPr>
-          <w:rFonts w:ascii="Consolas" w:cs="Consolas" w:eastAsia="Consolas" w:hAnsi="Consolas"/>
-          <w:sz w:val="18"/>
-          <w:szCs w:val="18"/>
-        </w:rPr>
-        <w:br/>
-        <w:t xml:space="preserve">    }</w:t>
-      </w:r>
-      <w:r>
-        <w:rPr>
-          <w:rFonts w:ascii="Consolas" w:cs="Consolas" w:eastAsia="Consolas" w:hAnsi="Consolas"/>
-          <w:sz w:val="18"/>
-          <w:szCs w:val="18"/>
-        </w:rPr>
-        <w:br/>
-        <w:t xml:space="preserve">    if (key == GLFW_KEY_UP) {</w:t>
-      </w:r>
-      <w:r>
-        <w:rPr>
-          <w:rFonts w:ascii="Consolas" w:cs="Consolas" w:eastAsia="Consolas" w:hAnsi="Consolas"/>
-          <w:sz w:val="18"/>
-          <w:szCs w:val="18"/>
-        </w:rPr>
-        <w:br/>
-        <w:t xml:space="preserve">        if (ctrl) g_pitch -= 2.0f;            // Control Up Arrow: pitch -= 2 deg</w:t>
-      </w:r>
-      <w:r>
-        <w:rPr>
-          <w:rFonts w:ascii="Consolas" w:cs="Consolas" w:eastAsia="Consolas" w:hAnsi="Consolas"/>
-          <w:sz w:val="18"/>
-          <w:szCs w:val="18"/>
-        </w:rPr>
-        <w:br/>
-        <w:t xml:space="preserve">        else if (shift) g_pos.z += 1.0f;      // Shift Up Arrow: slide +Z ("in")</w:t>
-      </w:r>
-      <w:r>
-        <w:rPr>
-          <w:rFonts w:ascii="Consolas" w:cs="Consolas" w:eastAsia="Consolas" w:hAnsi="Consolas"/>
-          <w:sz w:val="18"/>
-          <w:szCs w:val="18"/>
-        </w:rPr>
-        <w:br/>
-        <w:t xml:space="preserve">        else g_pos.y += 1.0f;                 // Up Arrow: slide +Y</w:t>
-      </w:r>
-      <w:r>
-        <w:rPr>
-          <w:rFonts w:ascii="Consolas" w:cs="Consolas" w:eastAsia="Consolas" w:hAnsi="Consolas"/>
-          <w:sz w:val="18"/>
-          <w:szCs w:val="18"/>
-        </w:rPr>
-        <w:br/>
-        <w:t xml:space="preserve">        return;</w:t>
-      </w:r>
-      <w:r>
-        <w:rPr>
-          <w:rFonts w:ascii="Consolas" w:cs="Consolas" w:eastAsia="Consolas" w:hAnsi="Consolas"/>
-          <w:sz w:val="18"/>
-          <w:szCs w:val="18"/>
-        </w:rPr>
-        <w:br/>
-        <w:t xml:space="preserve">    }</w:t>
-      </w:r>
-      <w:r>
-        <w:rPr>
-          <w:rFonts w:ascii="Consolas" w:cs="Consolas" w:eastAsia="Consolas" w:hAnsi="Consolas"/>
-          <w:sz w:val="18"/>
-          <w:szCs w:val="18"/>
-        </w:rPr>
-        <w:br/>
-        <w:t xml:space="preserve">    if (key == GLFW_KEY_DOWN) {</w:t>
-      </w:r>
-      <w:r>
-        <w:rPr>
-          <w:rFonts w:ascii="Consolas" w:cs="Consolas" w:eastAsia="Consolas" w:hAnsi="Consolas"/>
-          <w:sz w:val="18"/>
-          <w:szCs w:val="18"/>
-        </w:rPr>
-        <w:br/>
-        <w:t xml:space="preserve">        if (ctrl) g_pitch += 2.0f;            // Control Down Arrow: pitch += 2 deg</w:t>
-      </w:r>
-      <w:r>
-        <w:rPr>
-          <w:rFonts w:ascii="Consolas" w:cs="Consolas" w:eastAsia="Consolas" w:hAnsi="Consolas"/>
-          <w:sz w:val="18"/>
-          <w:szCs w:val="18"/>
-        </w:rPr>
-        <w:br/>
-        <w:t xml:space="preserve">        else if (shift) g_pos.z -= 1.0f;      // Shift Down Arrow: slide -Z ("out")</w:t>
-      </w:r>
-      <w:r>
-        <w:rPr>
-          <w:rFonts w:ascii="Consolas" w:cs="Consolas" w:eastAsia="Consolas" w:hAnsi="Consolas"/>
-          <w:sz w:val="18"/>
-          <w:szCs w:val="18"/>
-        </w:rPr>
-        <w:br/>
-        <w:t xml:space="preserve">        else g_pos.y -= 1.0f;                 // Down Arrow: slide -Y</w:t>
-      </w:r>
-      <w:r>
-        <w:rPr>
-          <w:rFonts w:ascii="Consolas" w:cs="Consolas" w:eastAsia="Consolas" w:hAnsi="Consolas"/>
-          <w:sz w:val="18"/>
-          <w:szCs w:val="18"/>
-        </w:rPr>
-        <w:br/>
-        <w:t xml:space="preserve">        return;</w:t>
-      </w:r>
-      <w:r>
-        <w:rPr>
-          <w:rFonts w:ascii="Consolas" w:cs="Consolas" w:eastAsia="Consolas" w:hAnsi="Consolas"/>
-          <w:sz w:val="18"/>
-          <w:szCs w:val="18"/>
-        </w:rPr>
-        <w:br/>
-        <w:t xml:space="preserve">    }</w:t>
-      </w:r>
-      <w:r>
-        <w:rPr>
-          <w:rFonts w:ascii="Consolas" w:cs="Consolas" w:eastAsia="Consolas" w:hAnsi="Consolas"/>
-          <w:sz w:val="18"/>
-          <w:szCs w:val="18"/>
-        </w:rPr>
-        <w:br/>
-        <w:t xml:space="preserve">}</w:t>
       </w:r>
     </w:p>
     <w:p>
@@ -2794,15 +2452,6 @@
           <w:sz w:val="18"/>
           <w:szCs w:val="18"/>
         </w:rPr>
-        <w:t xml:space="preserve">    while(!glfwWindowShouldClose(win)){</w:t>
-      </w:r>
-      <w:r>
-        <w:rPr>
-          <w:rFonts w:ascii="Consolas" w:cs="Consolas" w:eastAsia="Consolas" w:hAnsi="Consolas"/>
-          <w:sz w:val="18"/>
-          <w:szCs w:val="18"/>
-        </w:rPr>
-        <w:br/>
         <w:t xml:space="preserve">        // Camera orientation: build a rotation matrix from yaw (world Y),</w:t>
       </w:r>
       <w:r>
@@ -4128,7 +3777,7 @@
         </w:rPr>
         <w:t xml:space="preserve">Video (in repository): </w:t>
       </w:r>
-      <w:hyperlink w:history="1" r:id="rIdnf_sqnm35wvawgmfscbhq">
+      <w:hyperlink w:history="1" r:id="rIdokxw0egchtehbxphohztu">
         <w:r>
           <w:rPr>
             <w:rStyle w:val="Hyperlink"/>
@@ -4234,7 +3883,7 @@
         </w:rPr>
         <w:t xml:space="preserve">Complete, commented source code, the README.md, Readme.txt, math derivations, screenshots, and navigation video are hosted at: </w:t>
       </w:r>
-      <w:hyperlink w:history="1" r:id="rIdhp80alrnvnztxyhfkn6i6">
+      <w:hyperlink w:history="1" r:id="rIdltlcipqnk6mxqmwushk8k">
         <w:r>
           <w:rPr>
             <w:rStyle w:val="Hyperlink"/>
@@ -4285,7 +3934,7 @@
           <w:sz w:val="22"/>
           <w:szCs w:val="22"/>
         </w:rPr>
-        <w:t xml:space="preserve">Khronos Group. (2024). OpenGL 4.1 core profile specification. https://www.khronos.org/registry/OpenGL/specs/gl/glspec41.core.pdf</w:t>
+        <w:t xml:space="preserve">de Vries, J. (2024). Learn OpenGL: Advanced lighting — normal mapping. https://learnopengl.com/Advanced-Lighting/Normal-Mapping</w:t>
       </w:r>
     </w:p>
     <w:p>
@@ -4299,7 +3948,7 @@
           <w:sz w:val="22"/>
           <w:szCs w:val="22"/>
         </w:rPr>
-        <w:t xml:space="preserve">Khronos Group. (2024). OpenGL shading language (GLSL) 4.10 specification. https://www.khronos.org/registry/OpenGL/specs/gl/GLSLangSpec.4.10.pdf</w:t>
+        <w:t xml:space="preserve">GLFW. (2024). GLFW documentation: Input guide. https://www.glfw.org/docs/latest/input_guide.html</w:t>
       </w:r>
     </w:p>
     <w:p>
@@ -4313,7 +3962,7 @@
           <w:sz w:val="22"/>
           <w:szCs w:val="22"/>
         </w:rPr>
-        <w:t xml:space="preserve">GLFW. (2024). GLFW documentation: Input guide. https://www.glfw.org/docs/latest/input_guide.html</w:t>
+        <w:t xml:space="preserve">Khronos Group. (2024). OpenGL 4.1 core profile specification. https://www.khronos.org/registry/OpenGL/specs/gl/glspec41.core.pdf</w:t>
       </w:r>
     </w:p>
     <w:p>
@@ -4327,7 +3976,7 @@
           <w:sz w:val="22"/>
           <w:szCs w:val="22"/>
         </w:rPr>
-        <w:t xml:space="preserve">OpenGL Wiki contributors. (2023). Bump mapping. Khronos OpenGL Wiki. https://www.khronos.org/opengl/wiki/Bump_Mapping</w:t>
+        <w:t xml:space="preserve">Khronos Group. (2024). OpenGL shading language (GLSL) 4.10 specification. https://www.khronos.org/registry/OpenGL/specs/gl/GLSLangSpec.4.10.pdf</w:t>
       </w:r>
     </w:p>
     <w:p>
@@ -4341,7 +3990,7 @@
           <w:sz w:val="22"/>
           <w:szCs w:val="22"/>
         </w:rPr>
-        <w:t xml:space="preserve">OpenGL Wiki contributors. (2023). Fresnel effect. Khronos OpenGL Wiki. https://www.khronos.org/opengl/wiki/Fresnel_effect</w:t>
+        <w:t xml:space="preserve">OpenGL Wiki contributors. (2023). Bump mapping. Khronos OpenGL Wiki. https://www.khronos.org/opengl/wiki/Bump_Mapping</w:t>
       </w:r>
     </w:p>
     <w:p>
@@ -4355,7 +4004,7 @@
           <w:sz w:val="22"/>
           <w:szCs w:val="22"/>
         </w:rPr>
-        <w:t xml:space="preserve">de Vries, J. (2024). Learn OpenGL: Advanced lighting — normal mapping. https://learnopengl.com/Advanced-Lighting/Normal-Mapping</w:t>
+        <w:t xml:space="preserve">OpenGL Wiki contributors. (2023). Fresnel effect. Khronos OpenGL Wiki. https://www.khronos.org/opengl/wiki/Fresnel_effect</w:t>
       </w:r>
     </w:p>
     <w:sectPr>

</xml_diff>